<commit_message>
feat(document-intelligence): kalem belgeleri, activity sablonu ve sablon unpublish
Odak kalem CoC/Activity uretimi, LINE-ACTIVITY-STD tasarimi, parametre uyarilari,
DI deep link ve kaynak editoru. Sablonlarda uretimde aktif / duzenlenebilir akisi
(unpublish API + Collabora salt okunur goruntuleme). Activity DOCX UTF-8 icerik dosyasi.

Co-authored-by: Cursor <cursoragent@cursor.com>
</commit_message>
<xml_diff>
--- a/docs/odak/document_intelligence/sample/ODK-COC-prod-current.docx
+++ b/docs/odak/document_intelligence/sample/ODK-COC-prod-current.docx
@@ -8,11 +8,15 @@
         <w:widowControl/>
         <w:jc w:val="both"/>
         <w:rPr>
-          <w:lang w:val="tr-TR"/>
-        </w:rPr>
-      </w:pPr>
-      <w:r>
-        <w:rPr>
+          <w:sz w:val="24"/>
+          <w:szCs w:val="24"/>
+        </w:rPr>
+      </w:pPr>
+      <w:r>
+        <w:rPr>
+          <w:rFonts w:eastAsia="MS Mincho" w:cs="Times New Roman" w:ascii="Cambria" w:hAnsi="Cambria"/>
+          <w:sz w:val="24"/>
+          <w:szCs w:val="24"/>
           <w:lang w:val="tr-TR"/>
         </w:rPr>
       </w:r>
@@ -23,11 +27,15 @@
         <w:widowControl/>
         <w:jc w:val="both"/>
         <w:rPr>
-          <w:lang w:val="tr-TR"/>
-        </w:rPr>
-      </w:pPr>
-      <w:r>
-        <w:rPr>
+          <w:sz w:val="24"/>
+          <w:szCs w:val="24"/>
+        </w:rPr>
+      </w:pPr>
+      <w:r>
+        <w:rPr>
+          <w:rFonts w:eastAsia="MS Mincho" w:cs="Times New Roman" w:ascii="Cambria" w:hAnsi="Cambria"/>
+          <w:sz w:val="24"/>
+          <w:szCs w:val="24"/>
           <w:lang w:val="tr-TR"/>
         </w:rPr>
       </w:r>
@@ -38,11 +46,15 @@
         <w:widowControl/>
         <w:jc w:val="both"/>
         <w:rPr>
-          <w:lang w:val="tr-TR"/>
-        </w:rPr>
-      </w:pPr>
-      <w:r>
-        <w:rPr>
+          <w:sz w:val="24"/>
+          <w:szCs w:val="24"/>
+        </w:rPr>
+      </w:pPr>
+      <w:r>
+        <w:rPr>
+          <w:rFonts w:eastAsia="MS Mincho" w:cs="Times New Roman" w:ascii="Cambria" w:hAnsi="Cambria"/>
+          <w:sz w:val="24"/>
+          <w:szCs w:val="24"/>
           <w:lang w:val="tr-TR"/>
         </w:rPr>
       </w:r>
@@ -53,11 +65,15 @@
         <w:widowControl/>
         <w:jc w:val="both"/>
         <w:rPr>
-          <w:lang w:val="tr-TR"/>
-        </w:rPr>
-      </w:pPr>
-      <w:r>
-        <w:rPr>
+          <w:sz w:val="24"/>
+          <w:szCs w:val="24"/>
+        </w:rPr>
+      </w:pPr>
+      <w:r>
+        <w:rPr>
+          <w:rFonts w:eastAsia="MS Mincho" w:cs="Times New Roman" w:ascii="Cambria" w:hAnsi="Cambria"/>
+          <w:sz w:val="24"/>
+          <w:szCs w:val="24"/>
           <w:lang w:val="tr-TR"/>
         </w:rPr>
       </w:r>
@@ -68,13 +84,20 @@
         <w:widowControl/>
         <w:jc w:val="both"/>
         <w:rPr>
-          <w:lang w:val="tr-TR"/>
-        </w:rPr>
-      </w:pPr>
-      <w:r>
-        <w:rPr>
-          <w:lang w:val="tr-TR"/>
-        </w:rPr>
+          <w:rFonts w:ascii="Cambria" w:hAnsi="Cambria" w:eastAsia="MS Mincho" w:cs="Times New Roman"/>
+          <w:sz w:val="24"/>
+          <w:szCs w:val="24"/>
+          <w:lang w:val="tr-TR"/>
+        </w:rPr>
+      </w:pPr>
+      <w:r>
+        <w:rPr>
+          <w:rFonts w:eastAsia="MS Mincho" w:cs="Times New Roman" w:ascii="Cambria" w:hAnsi="Cambria"/>
+          <w:sz w:val="24"/>
+          <w:szCs w:val="24"/>
+          <w:lang w:val="tr-TR"/>
+        </w:rPr>
+        <w:t xml:space="preserve">İş Paketi No                 : {{workPackageNo}}</w:t>
       </w:r>
     </w:p>
     <w:p>
@@ -83,13 +106,41 @@
         <w:widowControl/>
         <w:jc w:val="both"/>
         <w:rPr>
-          <w:lang w:val="tr-TR"/>
-        </w:rPr>
-      </w:pPr>
-      <w:r>
-        <w:rPr>
-          <w:lang w:val="tr-TR"/>
-        </w:rPr>
+          <w:rFonts w:ascii="Cambria" w:hAnsi="Cambria" w:eastAsia="MS Mincho" w:cs="Times New Roman"/>
+          <w:sz w:val="24"/>
+          <w:szCs w:val="24"/>
+          <w:lang w:val="tr-TR"/>
+        </w:rPr>
+      </w:pPr>
+      <w:r>
+        <w:rPr>
+          <w:rFonts w:eastAsia="MS Mincho" w:cs="Times New Roman" w:ascii="Cambria" w:hAnsi="Cambria"/>
+          <w:sz w:val="24"/>
+          <w:szCs w:val="24"/>
+          <w:lang w:val="tr-TR"/>
+        </w:rPr>
+        <w:t xml:space="preserve">Düzenlenme Tarihi   : {{issueDate}}</w:t>
+      </w:r>
+    </w:p>
+    <w:p>
+      <w:pPr>
+        <w:pStyle w:val="Normal"/>
+        <w:widowControl/>
+        <w:rPr>
+          <w:rFonts w:ascii="Cambria" w:hAnsi="Cambria" w:eastAsia="MS Mincho" w:cs="Times New Roman"/>
+          <w:sz w:val="24"/>
+          <w:szCs w:val="24"/>
+          <w:lang w:val="tr-TR"/>
+        </w:rPr>
+      </w:pPr>
+      <w:r>
+        <w:rPr>
+          <w:rFonts w:eastAsia="MS Mincho" w:cs="Times New Roman" w:ascii="Cambria" w:hAnsi="Cambria"/>
+          <w:sz w:val="24"/>
+          <w:szCs w:val="24"/>
+          <w:lang w:val="tr-TR"/>
+        </w:rPr>
+        <w:t xml:space="preserve">Firma Bilgileri            : {{customerName}}</w:t>
       </w:r>
     </w:p>
     <w:p>
@@ -98,6 +149,9 @@
         <w:widowControl/>
         <w:jc w:val="both"/>
         <w:rPr>
+          <w:rFonts w:ascii="Cambria" w:hAnsi="Cambria" w:eastAsia="MS Mincho" w:cs="Times New Roman"/>
+          <w:sz w:val="24"/>
+          <w:szCs w:val="24"/>
           <w:lang w:val="tr-TR"/>
         </w:rPr>
       </w:pPr>
@@ -108,7 +162,7 @@
           <w:szCs w:val="24"/>
           <w:lang w:val="tr-TR"/>
         </w:rPr>
-        <w:t>Belge Numarası         : ODK-COC-23-202</w:t>
+        <w:t xml:space="preserve">Sipariş No                    : {{orderNo}}</w:t>
       </w:r>
     </w:p>
     <w:p>
@@ -117,6 +171,9 @@
         <w:widowControl/>
         <w:jc w:val="both"/>
         <w:rPr>
+          <w:rFonts w:ascii="Cambria" w:hAnsi="Cambria" w:eastAsia="MS Mincho" w:cs="Times New Roman"/>
+          <w:sz w:val="24"/>
+          <w:szCs w:val="24"/>
           <w:lang w:val="tr-TR"/>
         </w:rPr>
       </w:pPr>
@@ -127,7 +184,7 @@
           <w:szCs w:val="24"/>
           <w:lang w:val="tr-TR"/>
         </w:rPr>
-        <w:t>İş Paketi No                 : 2023-011</w:t>
+        <w:t xml:space="preserve">Parça Tanımı              : {{partDescription}}</w:t>
       </w:r>
     </w:p>
     <w:p>
@@ -136,6 +193,9 @@
         <w:widowControl/>
         <w:jc w:val="both"/>
         <w:rPr>
+          <w:rFonts w:ascii="Cambria" w:hAnsi="Cambria" w:eastAsia="MS Mincho" w:cs="Times New Roman"/>
+          <w:sz w:val="24"/>
+          <w:szCs w:val="24"/>
           <w:lang w:val="tr-TR"/>
         </w:rPr>
       </w:pPr>
@@ -146,25 +206,7 @@
           <w:szCs w:val="24"/>
           <w:lang w:val="tr-TR"/>
         </w:rPr>
-        <w:t>Düzenlenme Tarihi   : 25.05.2023</w:t>
-      </w:r>
-    </w:p>
-    <w:p>
-      <w:pPr>
-        <w:pStyle w:val="Normal"/>
-        <w:widowControl/>
-        <w:rPr>
-          <w:lang w:val="tr-TR"/>
-        </w:rPr>
-      </w:pPr>
-      <w:r>
-        <w:rPr>
-          <w:rFonts w:eastAsia="MS Mincho" w:cs="Times New Roman" w:ascii="Cambria" w:hAnsi="Cambria"/>
-          <w:sz w:val="24"/>
-          <w:szCs w:val="24"/>
-          <w:lang w:val="tr-TR"/>
-        </w:rPr>
-        <w:t xml:space="preserve">Firma Bilgileri            : ASELSAN                          </w:t>
+        <w:t xml:space="preserve">Teknik Resim No       : {{drawingNo}} ({{drawingRef}})</w:t>
       </w:r>
     </w:p>
     <w:p>
@@ -173,63 +215,9 @@
         <w:widowControl/>
         <w:jc w:val="both"/>
         <w:rPr>
-          <w:lang w:val="tr-TR"/>
-        </w:rPr>
-      </w:pPr>
-      <w:r>
-        <w:rPr>
-          <w:rFonts w:eastAsia="MS Mincho" w:cs="Times New Roman" w:ascii="Cambria" w:hAnsi="Cambria"/>
-          <w:sz w:val="24"/>
-          <w:szCs w:val="24"/>
-          <w:lang w:val="tr-TR"/>
-        </w:rPr>
-        <w:t xml:space="preserve">Sipariş No                    : 23Y00030FA          </w:t>
-      </w:r>
-    </w:p>
-    <w:p>
-      <w:pPr>
-        <w:pStyle w:val="Normal"/>
-        <w:widowControl/>
-        <w:jc w:val="both"/>
-        <w:rPr>
-          <w:lang w:val="tr-TR"/>
-        </w:rPr>
-      </w:pPr>
-      <w:r>
-        <w:rPr>
-          <w:rFonts w:eastAsia="MS Mincho" w:cs="Times New Roman" w:ascii="Cambria" w:hAnsi="Cambria"/>
-          <w:sz w:val="24"/>
-          <w:szCs w:val="24"/>
-          <w:lang w:val="tr-TR"/>
-        </w:rPr>
-        <w:t>Parça Tanımı              : POLARIZOR BOYNUZ BANT2 DAR</w:t>
-      </w:r>
-    </w:p>
-    <w:p>
-      <w:pPr>
-        <w:pStyle w:val="Normal"/>
-        <w:widowControl/>
-        <w:jc w:val="both"/>
-        <w:rPr>
-          <w:lang w:val="tr-TR"/>
-        </w:rPr>
-      </w:pPr>
-      <w:r>
-        <w:rPr>
-          <w:rFonts w:eastAsia="MS Mincho" w:cs="Times New Roman" w:ascii="Cambria" w:hAnsi="Cambria"/>
-          <w:sz w:val="24"/>
-          <w:szCs w:val="24"/>
-          <w:lang w:val="tr-TR"/>
-        </w:rPr>
-        <w:t>Teknik Resim No       : MN-7792-0020 (GN-0000-0242)</w:t>
-      </w:r>
-    </w:p>
-    <w:p>
-      <w:pPr>
-        <w:pStyle w:val="Normal"/>
-        <w:widowControl/>
-        <w:jc w:val="both"/>
-        <w:rPr>
+          <w:rFonts w:ascii="Cambria" w:hAnsi="Cambria" w:eastAsia="MS Mincho" w:cs="Times New Roman"/>
+          <w:sz w:val="24"/>
+          <w:szCs w:val="24"/>
           <w:lang w:val="tr-TR"/>
         </w:rPr>
       </w:pPr>
@@ -242,7 +230,7 @@
           <w:szCs w:val="24"/>
           <w:lang w:val="tr-TR"/>
         </w:rPr>
-        <w:t xml:space="preserve">TR Revizyon No         : REV AA     </w:t>
+        <w:t xml:space="preserve">TR Revizyon No         : {{drawingRevision}}</w:t>
       </w:r>
     </w:p>
     <w:p>
@@ -251,6 +239,9 @@
         <w:widowControl/>
         <w:jc w:val="both"/>
         <w:rPr>
+          <w:rFonts w:ascii="Cambria" w:hAnsi="Cambria" w:eastAsia="MS Mincho" w:cs="Times New Roman"/>
+          <w:sz w:val="24"/>
+          <w:szCs w:val="24"/>
           <w:lang w:val="tr-TR"/>
         </w:rPr>
       </w:pPr>
@@ -261,14 +252,17 @@
           <w:szCs w:val="24"/>
           <w:lang w:val="tr-TR"/>
         </w:rPr>
-        <w:t xml:space="preserve">Parça Adedi                 : 1 ADET             </w:t>
-      </w:r>
-    </w:p>
-    <w:p>
-      <w:pPr>
-        <w:pStyle w:val="Normal"/>
-        <w:widowControl/>
-        <w:rPr>
+        <w:t xml:space="preserve">Parça Adedi                 : {{partQuantity}}</w:t>
+      </w:r>
+    </w:p>
+    <w:p>
+      <w:pPr>
+        <w:pStyle w:val="Normal"/>
+        <w:widowControl/>
+        <w:rPr>
+          <w:rFonts w:ascii="Cambria" w:hAnsi="Cambria" w:eastAsia="MS Mincho" w:cs="Times New Roman"/>
+          <w:sz w:val="24"/>
+          <w:szCs w:val="24"/>
           <w:lang w:val="tr-TR"/>
         </w:rPr>
       </w:pPr>
@@ -279,7 +273,7 @@
           <w:szCs w:val="24"/>
           <w:lang w:val="tr-TR"/>
         </w:rPr>
-        <w:t>Parça Seri No              : M27054-01</w:t>
+        <w:t xml:space="preserve">Parça Seri No              : {{serialNo}}</w:t>
       </w:r>
     </w:p>
     <w:p>
@@ -333,6 +327,9 @@
         <w:widowControl/>
         <w:jc w:val="both"/>
         <w:rPr>
+          <w:rFonts w:ascii="Cambria" w:hAnsi="Cambria" w:eastAsia="MS Mincho" w:cs="Times New Roman"/>
+          <w:sz w:val="24"/>
+          <w:szCs w:val="24"/>
           <w:lang w:val="tr-TR"/>
         </w:rPr>
       </w:pPr>
@@ -343,7 +340,7 @@
           <w:szCs w:val="24"/>
           <w:lang w:val="tr-TR"/>
         </w:rPr>
-        <w:t>23Y00030FA numaralı siparişinizde belirtilen ürünlerin GN-0000-0242</w:t>
+        <w:t xml:space="preserve">{{orderNo}} numaralı siparişinizde belirtilen ürünlerin {{drawingRef}}</w:t>
       </w:r>
     </w:p>
     <w:p>
@@ -353,6 +350,9 @@
         <w:ind w:right="760"/>
         <w:jc w:val="both"/>
         <w:rPr>
+          <w:rFonts w:ascii="Cambria" w:hAnsi="Cambria" w:eastAsia="MS Mincho" w:cs="Times New Roman"/>
+          <w:sz w:val="24"/>
+          <w:szCs w:val="24"/>
           <w:lang w:val="tr-TR"/>
         </w:rPr>
       </w:pPr>
@@ -363,7 +363,7 @@
           <w:szCs w:val="24"/>
           <w:lang w:val="tr-TR"/>
         </w:rPr>
-        <w:t xml:space="preserve">REV AA numaralı teknik resimde belirtilen isterlere uygun olarak üretildiğini beyan ederiz. </w:t>
+        <w:t xml:space="preserve">{{drawingRevision}} numaralı teknik resimde belirtilen isterlere uygun olarak üretildiğini beyan ederiz. </w:t>
       </w:r>
     </w:p>
     <w:p>
@@ -395,10 +395,7 @@
           <w:ilvl w:val="0"/>
           <w:numId w:val="2"/>
         </w:numPr>
-        <w:rPr>
-          <w:rFonts w:ascii="Calibri" w:hAnsi="Calibri"/>
-          <w:lang w:val="tr-TR"/>
-        </w:rPr>
+        <w:rPr/>
       </w:pPr>
       <w:r>
         <w:rPr>
@@ -407,7 +404,7 @@
           <w:szCs w:val="24"/>
           <w:lang w:val="tr-TR"/>
         </w:rPr>
-        <w:t xml:space="preserve">GN-0000-0242 </w:t>
+        <w:t xml:space="preserve">{{drawingRef}} </w:t>
       </w:r>
       <w:r>
         <w:rPr>
@@ -416,7 +413,7 @@
           <w:szCs w:val="24"/>
           <w:lang w:val="tr-TR"/>
         </w:rPr>
-        <w:t>Rev AA Not 11’de belirtilen sızdırmazlık test isterinin %100 test edildiğini ve 50 mbar test kriterini sağladığını beyan ederiz.</w:t>
+        <w:t xml:space="preserve">Rev {{drawingRevision}} Not {{leakTestNoteNo}}’de belirtilen sızdırmazlık test isterinin %100 test edildiğini ve {{leakTestPressureMbar}} mbar test kriterini sağladığını beyan ederiz.</w:t>
       </w:r>
     </w:p>
     <w:p>
@@ -468,6 +465,10 @@
         <w:widowControl/>
         <w:jc w:val="both"/>
         <w:rPr>
+          <w:rFonts w:ascii="Cambria" w:hAnsi="Cambria" w:eastAsia="MS Mincho" w:cs="Times New Roman"/>
+          <w:sz w:val="24"/>
+          <w:szCs w:val="24"/>
+          <w:u w:val="single"/>
           <w:lang w:val="tr-TR"/>
         </w:rPr>
       </w:pPr>
@@ -518,6 +519,9 @@
         <w:contextualSpacing/>
         <w:jc w:val="both"/>
         <w:rPr>
+          <w:rFonts w:ascii="Cambria" w:hAnsi="Cambria" w:eastAsia="MS Mincho" w:cs="Times New Roman"/>
+          <w:sz w:val="24"/>
+          <w:szCs w:val="24"/>
           <w:lang w:val="tr-TR"/>
         </w:rPr>
       </w:pPr>
@@ -544,6 +548,9 @@
         <w:contextualSpacing/>
         <w:jc w:val="both"/>
         <w:rPr>
+          <w:rFonts w:ascii="Cambria" w:hAnsi="Cambria" w:eastAsia="MS Mincho" w:cs="Times New Roman"/>
+          <w:sz w:val="24"/>
+          <w:szCs w:val="24"/>
           <w:lang w:val="tr-TR"/>
         </w:rPr>
       </w:pPr>
@@ -570,6 +577,9 @@
         <w:contextualSpacing/>
         <w:jc w:val="both"/>
         <w:rPr>
+          <w:rFonts w:ascii="Cambria" w:hAnsi="Cambria" w:eastAsia="MS Mincho" w:cs="Times New Roman"/>
+          <w:sz w:val="24"/>
+          <w:szCs w:val="24"/>
           <w:lang w:val="tr-TR"/>
         </w:rPr>
       </w:pPr>
@@ -656,6 +666,9 @@
         <w:ind w:hanging="0" w:left="5103"/>
         <w:jc w:val="center"/>
         <w:rPr>
+          <w:rFonts w:ascii="Calibri" w:hAnsi="Calibri" w:eastAsia="MS Mincho" w:cs="Times New Roman"/>
+          <w:sz w:val="20"/>
+          <w:szCs w:val="24"/>
           <w:lang w:val="tr-TR"/>
         </w:rPr>
       </w:pPr>
@@ -676,6 +689,12 @@
         <w:ind w:hanging="0" w:left="5103"/>
         <w:jc w:val="center"/>
         <w:rPr>
+          <w:rFonts w:ascii="Calibri" w:hAnsi="Calibri" w:eastAsia="MS Mincho" w:cs="Times New Roman"/>
+          <w:b/>
+          <w:bCs/>
+          <w:color w:val="000000"/>
+          <w:sz w:val="20"/>
+          <w:szCs w:val="24"/>
           <w:lang w:val="tr-TR"/>
         </w:rPr>
       </w:pPr>
@@ -689,7 +708,7 @@
           <w:szCs w:val="24"/>
           <w:lang w:val="tr-TR"/>
         </w:rPr>
-        <w:t>GİZEM CANDAŞ</w:t>
+        <w:t xml:space="preserve">{{signatoryName}}</w:t>
       </w:r>
     </w:p>
     <w:p>
@@ -699,6 +718,9 @@
         <w:ind w:hanging="0" w:left="5103"/>
         <w:jc w:val="center"/>
         <w:rPr>
+          <w:rFonts w:ascii="Calibri" w:hAnsi="Calibri" w:eastAsia="MS Mincho" w:cs="Times New Roman"/>
+          <w:sz w:val="20"/>
+          <w:szCs w:val="24"/>
           <w:lang w:val="tr-TR"/>
         </w:rPr>
       </w:pPr>
@@ -709,14 +731,20 @@
           <w:szCs w:val="24"/>
           <w:lang w:val="tr-TR"/>
         </w:rPr>
-        <w:t>KALİTE KONTROL YÖNETİCİSİ</w:t>
+        <w:t xml:space="preserve">{{signatoryTitle}}</w:t>
       </w:r>
     </w:p>
     <w:p>
       <w:pPr>
         <w:pStyle w:val="Normal"/>
         <w:jc w:val="both"/>
-        <w:rPr/>
+        <w:rPr>
+          <w:rFonts w:ascii="Calibri" w:hAnsi="Calibri" w:eastAsia="MS Mincho" w:cs="Times New Roman"/>
+          <w:color w:val="D0CECE"/>
+          <w:sz w:val="14"/>
+          <w:szCs w:val="24"/>
+          <w:lang w:val="tr-TR"/>
+        </w:rPr>
       </w:pPr>
       <w:bookmarkStart w:id="1" w:name="_Hlk120184430_Kopya_1"/>
       <w:bookmarkEnd w:id="1"/>
@@ -741,277 +769,770 @@
       </w:r>
     </w:p>
     <w:sectPr>
-      <w:headerReference w:type="even" r:id="rId2"/>
-      <w:headerReference w:type="default" r:id="rId3"/>
-      <w:headerReference w:type="first" r:id="rId4"/>
-      <w:footerReference w:type="even" r:id="rId5"/>
-      <w:footerReference w:type="default" r:id="rId6"/>
-      <w:footerReference w:type="first" r:id="rId7"/>
       <w:type w:val="nextPage"/>
-      <w:pgSz w:w="11906" w:h="16838"/>
-      <w:pgMar w:left="1797" w:right="1797" w:gutter="0" w:header="709" w:top="1440" w:footer="658" w:bottom="1440"/>
       <w:pgNumType w:fmt="decimal"/>
       <w:formProt w:val="false"/>
       <w:textDirection w:val="lrTb"/>
       <w:docGrid w:type="default" w:linePitch="100" w:charSpace="4096"/>
+      <w:headerReference r:id="rIdHeader1" w:type="default"/>
+      <w:pgSz w:w="11910" w:h="16840"/>
+      <w:pgMar w:top="1440" w:right="1797" w:bottom="1440" w:left="1797" w:header="709" w:footer="658" w:gutter="0"/>
+      <w:cols w:space="708"/>
+      <footerReference xmlns:p17="http://schemas.openxmlformats.org/wordprocessingml/2006/main" xmlns="http://schemas.openxmlformats.org/wordprocessingml/2006/main" r:id="rIdFooter1" p17:type="default"/>
     </w:sectPr>
   </w:body>
 </w:document>
 </file>
 
 <file path=word/footer1.xml><?xml version="1.0" encoding="utf-8"?>
-<w:ftr xmlns:o="urn:schemas-microsoft-com:office:office" xmlns:r="http://schemas.openxmlformats.org/officeDocument/2006/relationships" xmlns:v="urn:schemas-microsoft-com:vml" xmlns:w="http://schemas.openxmlformats.org/wordprocessingml/2006/main" xmlns:w10="urn:schemas-microsoft-com:office:word" xmlns:wp="http://schemas.openxmlformats.org/drawingml/2006/wordprocessingDrawing" xmlns:pic="http://schemas.openxmlformats.org/drawingml/2006/picture" xmlns:wps="http://schemas.microsoft.com/office/word/2010/wordprocessingShape" xmlns:wpg="http://schemas.microsoft.com/office/word/2010/wordprocessingGroup" xmlns:mc="http://schemas.openxmlformats.org/markup-compatibility/2006" xmlns:wp14="http://schemas.microsoft.com/office/word/2010/wordprocessingDrawing" xmlns:w14="http://schemas.microsoft.com/office/word/2010/wordml" xmlns:w15="http://schemas.microsoft.com/office/word/2012/wordml" mc:Ignorable="w14 wp14 w15">
-  <w:p>
-    <w:pPr>
-      <w:pStyle w:val="Footer"/>
-      <w:rPr/>
-    </w:pPr>
-    <w:r>
-      <w:rPr/>
-    </w:r>
-  </w:p>
+<w:ftr xmlns:w="http://schemas.openxmlformats.org/wordprocessingml/2006/main">
+  <w:tbl>
+    <w:tblPr>
+      <w:tblW w:w="5000" w:type="pct"/>
+      <w:tblInd w:w="-567" w:type="dxa"/>
+      <w:tblLayout w:type="fixed"/>
+      <w:tblCellMar>
+        <w:top w:w="0" w:type="dxa"/>
+        <w:left w:w="0" w:type="dxa"/>
+        <w:bottom w:w="0" w:type="dxa"/>
+        <w:right w:w="0" w:type="dxa"/>
+      </w:tblCellMar>
+      <w:tblLook w:val="04A0" w:firstRow="1" w:lastRow="0" w:firstColumn="1" w:lastColumn="0" w:noHBand="0" w:noVBand="1"/>
+    </w:tblPr>
+    <w:tblGrid>
+      <w:gridCol w:w="4158"/>
+      <w:gridCol w:w="4158"/>
+    </w:tblGrid>
+    <w:tr>
+      <w:tc>
+        <w:tcPr>
+          <w:gridSpan w:val="2"/>
+          <w:tcW w:w="8316" w:type="dxa"/>
+        </w:tcPr>
+        <w:p>
+          <w:pPr>
+            <w:jc w:val="both"/>
+          </w:pPr>
+          <w:r>
+            <w:rPr>
+              <w:sz w:val="14"/>
+              <w:szCs w:val="12"/>
+            </w:rPr>
+            <w:t xml:space="preserve">F86 Rev04 30.11.2022</w:t>
+          </w:r>
+        </w:p>
+      </w:tc>
+    </w:tr>
+    <w:tr>
+      <w:tc>
+        <w:tcPr>
+          <w:tcW w:w="4158" w:type="dxa"/>
+          <w:vAlign w:val="top"/>
+        </w:tcPr>
+        <w:p>
+          <w:pPr>
+            <w:jc w:val="both"/>
+          </w:pPr>
+          <w:r>
+            <w:rPr>
+              <w:rFonts w:ascii="Tahoma" w:hAnsi="Tahoma" w:cs="Tahoma"/>
+              <w:b/>
+              <w:color w:val="231F20"/>
+              <w:w w:val="80"/>
+              <w:sz w:val="16"/>
+              <w:szCs w:val="16"/>
+            </w:rPr>
+            <w:t xml:space="preserve">Merkez Ofis</w:t>
+          </w:r>
+        </w:p>
+      </w:tc>
+      <w:tc>
+        <w:tcPr>
+          <w:tcW w:w="4158" w:type="dxa"/>
+          <w:vAlign w:val="top"/>
+        </w:tcPr>
+        <w:p>
+          <w:pPr>
+            <w:jc w:val="both"/>
+          </w:pPr>
+          <w:r>
+            <w:rPr>
+              <w:rFonts w:ascii="Tahoma" w:hAnsi="Tahoma" w:cs="Tahoma"/>
+              <w:b/>
+              <w:color w:val="231F20"/>
+              <w:w w:val="80"/>
+              <w:sz w:val="16"/>
+              <w:szCs w:val="16"/>
+            </w:rPr>
+            <w:t xml:space="preserve">Üretim</w:t>
+          </w:r>
+        </w:p>
+      </w:tc>
+    </w:tr>
+    <w:tr>
+      <w:tc>
+        <w:tcPr>
+          <w:tcW w:w="4158" w:type="dxa"/>
+          <w:vAlign w:val="top"/>
+        </w:tcPr>
+        <w:p>
+          <w:pPr>
+            <w:jc w:val="both"/>
+          </w:pPr>
+          <w:r>
+            <w:rPr>
+              <w:rFonts w:ascii="Tahoma" w:hAnsi="Tahoma" w:cs="Tahoma"/>
+              <w:color w:val="231F20"/>
+              <w:w w:val="80"/>
+              <w:kern w:val="22"/>
+              <w:sz w:val="16"/>
+              <w:szCs w:val="16"/>
+            </w:rPr>
+            <w:t xml:space="preserve">Cinnah Caddesi No:11/5 06690 Çankaya – Ankara/TÜRKİYE</w:t>
+          </w:r>
+        </w:p>
+      </w:tc>
+      <w:tc>
+        <w:tcPr>
+          <w:tcW w:w="4158" w:type="dxa"/>
+          <w:vAlign w:val="top"/>
+        </w:tcPr>
+        <w:p>
+          <w:pPr>
+            <w:jc w:val="both"/>
+          </w:pPr>
+          <w:r>
+            <w:rPr>
+              <w:rFonts w:ascii="Tahoma" w:hAnsi="Tahoma" w:cs="Tahoma"/>
+              <w:color w:val="231F20"/>
+              <w:w w:val="80"/>
+              <w:kern w:val="22"/>
+              <w:sz w:val="16"/>
+              <w:szCs w:val="16"/>
+            </w:rPr>
+            <w:t xml:space="preserve">Ostim OSB Mh. 1227 Cd. No: 6/C 06374 Ostim -Ankara-/TÜRKİYE</w:t>
+          </w:r>
+        </w:p>
+      </w:tc>
+    </w:tr>
+    <w:tr>
+      <w:tc>
+        <w:tcPr>
+          <w:tcW w:w="4158" w:type="dxa"/>
+          <w:vAlign w:val="top"/>
+        </w:tcPr>
+        <w:p>
+          <w:pPr>
+            <w:jc w:val="both"/>
+          </w:pPr>
+          <w:r>
+            <w:rPr>
+              <w:rFonts w:ascii="Tahoma" w:hAnsi="Tahoma" w:cs="Tahoma"/>
+              <w:color w:val="231F20"/>
+              <w:w w:val="80"/>
+              <w:kern w:val="22"/>
+              <w:sz w:val="16"/>
+              <w:szCs w:val="16"/>
+            </w:rPr>
+            <w:t xml:space="preserve">Tel: +90 312 466 19 22     Faks: +90 312 426 85 14</w:t>
+          </w:r>
+        </w:p>
+      </w:tc>
+      <w:tc>
+        <w:tcPr>
+          <w:tcW w:w="4158" w:type="dxa"/>
+          <w:vAlign w:val="top"/>
+        </w:tcPr>
+        <w:p>
+          <w:pPr>
+            <w:jc w:val="both"/>
+          </w:pPr>
+          <w:r>
+            <w:rPr>
+              <w:rFonts w:ascii="Tahoma" w:hAnsi="Tahoma" w:cs="Tahoma"/>
+              <w:color w:val="231F20"/>
+              <w:w w:val="80"/>
+              <w:kern w:val="22"/>
+              <w:sz w:val="16"/>
+              <w:szCs w:val="16"/>
+            </w:rPr>
+            <w:t xml:space="preserve">Tel: +90 312 354 90 81     Faks: +90 312 354 90 82</w:t>
+          </w:r>
+        </w:p>
+      </w:tc>
+    </w:tr>
+    <w:tr>
+      <w:tc>
+        <w:tcPr>
+          <w:gridSpan w:val="2"/>
+          <w:tcW w:w="8316" w:type="dxa"/>
+        </w:tcPr>
+        <w:p>
+          <w:pPr>
+            <w:jc w:val="both"/>
+          </w:pPr>
+          <w:r>
+            <w:rPr>
+              <w:sz w:val="16"/>
+              <w:szCs w:val="16"/>
+            </w:rPr>
+            <w:t xml:space="preserve"/>
+          </w:r>
+        </w:p>
+      </w:tc>
+    </w:tr>
+  </w:tbl>
 </w:ftr>
 </file>
 
 <file path=word/footer2.xml><?xml version="1.0" encoding="utf-8"?>
 <w:ftr xmlns:o="urn:schemas-microsoft-com:office:office" xmlns:r="http://schemas.openxmlformats.org/officeDocument/2006/relationships" xmlns:v="urn:schemas-microsoft-com:vml" xmlns:w="http://schemas.openxmlformats.org/wordprocessingml/2006/main" xmlns:w10="urn:schemas-microsoft-com:office:word" xmlns:wp="http://schemas.openxmlformats.org/drawingml/2006/wordprocessingDrawing" xmlns:pic="http://schemas.openxmlformats.org/drawingml/2006/picture" xmlns:wps="http://schemas.microsoft.com/office/word/2010/wordprocessingShape" xmlns:wpg="http://schemas.microsoft.com/office/word/2010/wordprocessingGroup" xmlns:mc="http://schemas.openxmlformats.org/markup-compatibility/2006" xmlns:wp14="http://schemas.microsoft.com/office/word/2010/wordprocessingDrawing" xmlns:w14="http://schemas.microsoft.com/office/word/2010/wordml" xmlns:w15="http://schemas.microsoft.com/office/word/2012/wordml" mc:Ignorable="w14 wp14 w15">
-  <w:p>
-    <w:pPr>
-      <w:pStyle w:val="Normal"/>
-      <w:ind w:left="-567"/>
-      <w:jc w:val="both"/>
-      <w:rPr/>
-    </w:pPr>
-    <w:r>
-      <w:rPr>
-        <w:sz w:val="14"/>
-        <w:szCs w:val="14"/>
-      </w:rPr>
-      <w:t>F86 Rev04 30.11.2022</w:t>
-    </w:r>
-  </w:p>
-  <w:p>
-    <w:pPr>
-      <w:pStyle w:val="Normal"/>
-      <w:tabs>
-        <w:tab w:val="clear" w:pos="720"/>
-        <w:tab w:val="center" w:pos="4819" w:leader="none"/>
-      </w:tabs>
-      <w:ind w:left="-567"/>
-      <w:jc w:val="both"/>
-      <w:rPr/>
-    </w:pPr>
-    <w:r>
-      <w:rPr>
-        <w:rFonts w:cs="Tahoma" w:ascii="Tahoma" w:hAnsi="Tahoma"/>
-        <w:b/>
-        <w:color w:val="231F20"/>
-        <w:sz w:val="16"/>
-        <w:szCs w:val="16"/>
-      </w:rPr>
-      <w:t>Merkez Ofis</w:t>
-      <w:tab/>
-      <w:t>Üretim</w:t>
-    </w:r>
-  </w:p>
-  <w:p>
-    <w:pPr>
-      <w:pStyle w:val="Normal"/>
-      <w:tabs>
-        <w:tab w:val="clear" w:pos="720"/>
-        <w:tab w:val="center" w:pos="4819" w:leader="none"/>
-      </w:tabs>
-      <w:ind w:left="-567"/>
-      <w:jc w:val="both"/>
-      <w:rPr/>
-    </w:pPr>
-    <w:r>
-      <w:rPr>
-        <w:rFonts w:cs="Tahoma" w:ascii="Tahoma" w:hAnsi="Tahoma"/>
-        <w:color w:val="231F20"/>
-        <w:sz w:val="16"/>
-        <w:szCs w:val="16"/>
-      </w:rPr>
-      <w:t>Cinnah Caddesi No:11/5 06690 Çankaya – Ankara/TÜRKİYE</w:t>
-      <w:tab/>
-      <w:t xml:space="preserve">                OSB Mh. 1227 Cd. No: 6/C 06374 OstimAnkara-/TÜRKİYE</w:t>
-    </w:r>
-  </w:p>
-  <w:p>
-    <w:pPr>
-      <w:pStyle w:val="Normal"/>
-      <w:pBdr>
-        <w:top w:val="single" w:sz="12" w:space="1" w:color="231F20"/>
-      </w:pBdr>
-      <w:ind w:left="-567"/>
-      <w:rPr/>
-    </w:pPr>
-    <w:r>
-      <w:rPr/>
-    </w:r>
-  </w:p>
-  <w:p>
-    <w:pPr>
-      <w:pStyle w:val="Normal"/>
-      <w:tabs>
-        <w:tab w:val="clear" w:pos="720"/>
-        <w:tab w:val="center" w:pos="4819" w:leader="none"/>
-      </w:tabs>
-      <w:ind w:left="-567"/>
-      <w:jc w:val="both"/>
-      <w:rPr/>
-    </w:pPr>
-    <w:r>
-      <w:rPr>
-        <w:rFonts w:cs="Tahoma" w:ascii="Tahoma" w:hAnsi="Tahoma"/>
-        <w:color w:val="231F20"/>
-        <w:sz w:val="16"/>
-        <w:szCs w:val="16"/>
-      </w:rPr>
-      <w:t>Tel: +90 312 466 19 22     Faks: +90 312 426 85 14</w:t>
-      <w:tab/>
-      <w:t>Tel: +90 312 354 90 81     Faks: +90 312 354 90 82</w:t>
-    </w:r>
-  </w:p>
-  <w:p>
-    <w:pPr>
-      <w:pStyle w:val="Normal"/>
-      <w:ind w:left="-567"/>
-      <w:jc w:val="both"/>
-      <w:rPr/>
-    </w:pPr>
-    <w:r>
-      <w:rPr/>
-    </w:r>
-  </w:p>
+  <w:tbl>
+    <w:tblPr>
+      <w:tblW w:w="5000" w:type="pct"/>
+      <w:jc w:val="left"/>
+      <w:tblInd w:w="0" w:type="dxa"/>
+      <w:tblLayout w:type="fixed"/>
+      <w:tblCellMar>
+        <w:top w:w="0" w:type="dxa"/>
+        <w:left w:w="108" w:type="dxa"/>
+        <w:bottom w:w="0" w:type="dxa"/>
+        <w:right w:w="108" w:type="dxa"/>
+      </w:tblCellMar>
+      <w:tblLook w:val="04a0" w:noHBand="0" w:noVBand="1" w:firstColumn="1" w:lastRow="0" w:lastColumn="0" w:firstRow="1"/>
+    </w:tblPr>
+    <w:tblGrid>
+      <w:gridCol w:w="4155"/>
+      <w:gridCol w:w="4156"/>
+    </w:tblGrid>
+    <w:tr>
+      <w:trPr/>
+      <w:tc>
+        <w:tcPr>
+          <w:tcW w:w="8311" w:type="dxa"/>
+          <w:gridSpan w:val="2"/>
+          <w:tcBorders/>
+        </w:tcPr>
+        <w:p>
+          <w:pPr>
+            <w:pStyle w:val="Normal"/>
+            <w:ind w:left="-567"/>
+            <w:jc w:val="both"/>
+            <w:rPr/>
+          </w:pPr>
+          <w:r>
+            <w:rPr>
+              <w:sz w:val="14"/>
+              <w:szCs w:val="12"/>
+            </w:rPr>
+            <w:t>F86 Rev04 30.11.2022</w:t>
+          </w:r>
+        </w:p>
+      </w:tc>
+    </w:tr>
+    <w:tr>
+      <w:trPr/>
+      <w:tc>
+        <w:tcPr>
+          <w:tcW w:w="4155" w:type="dxa"/>
+          <w:tcBorders/>
+        </w:tcPr>
+        <w:p>
+          <w:pPr>
+            <w:pStyle w:val="Normal"/>
+            <w:ind w:left="-567"/>
+            <w:jc w:val="both"/>
+            <w:rPr/>
+          </w:pPr>
+          <w:r>
+            <w:rPr>
+              <w:rFonts w:cs="Tahoma" w:ascii="Tahoma" w:hAnsi="Tahoma"/>
+              <w:b/>
+              <w:color w:val="231F20"/>
+              <w:w w:val="80"/>
+              <w:sz w:val="16"/>
+              <w:szCs w:val="16"/>
+            </w:rPr>
+            <w:t>Merkez Ofis</w:t>
+          </w:r>
+        </w:p>
+      </w:tc>
+      <w:tc>
+        <w:tcPr>
+          <w:tcW w:w="4156" w:type="dxa"/>
+          <w:tcBorders/>
+        </w:tcPr>
+        <w:p>
+          <w:pPr>
+            <w:pStyle w:val="Normal"/>
+            <w:ind w:left="-567"/>
+            <w:jc w:val="both"/>
+            <w:rPr/>
+          </w:pPr>
+          <w:r>
+            <w:rPr>
+              <w:rFonts w:cs="Tahoma" w:ascii="Tahoma" w:hAnsi="Tahoma"/>
+              <w:b/>
+              <w:color w:val="231F20"/>
+              <w:w w:val="80"/>
+              <w:sz w:val="16"/>
+              <w:szCs w:val="16"/>
+            </w:rPr>
+            <w:t>Üretim</w:t>
+          </w:r>
+        </w:p>
+      </w:tc>
+    </w:tr>
+    <w:tr>
+      <w:trPr/>
+      <w:tc>
+        <w:tcPr>
+          <w:tcW w:w="4155" w:type="dxa"/>
+          <w:tcBorders/>
+        </w:tcPr>
+        <w:p>
+          <w:pPr>
+            <w:pStyle w:val="Normal"/>
+            <w:ind w:left="-567"/>
+            <w:jc w:val="both"/>
+            <w:rPr/>
+          </w:pPr>
+          <w:r>
+            <w:rPr>
+              <w:rFonts w:cs="Tahoma" w:ascii="Tahoma" w:hAnsi="Tahoma"/>
+              <w:color w:val="231F20"/>
+              <w:w w:val="80"/>
+              <w:kern w:val="2"/>
+              <w:sz w:val="16"/>
+              <w:szCs w:val="16"/>
+            </w:rPr>
+            <w:t>Cinnah Caddesi No:11/5 06690 Çankaya – Ankara/TÜRKİYE</w:t>
+          </w:r>
+        </w:p>
+      </w:tc>
+      <w:tc>
+        <w:tcPr>
+          <w:tcW w:w="4156" w:type="dxa"/>
+          <w:tcBorders/>
+        </w:tcPr>
+        <w:p>
+          <w:pPr>
+            <w:pStyle w:val="Normal"/>
+            <w:ind w:left="-567"/>
+            <w:jc w:val="both"/>
+            <w:rPr/>
+          </w:pPr>
+          <w:r>
+            <w:rPr>
+              <w:rFonts w:cs="Tahoma" w:ascii="Tahoma" w:hAnsi="Tahoma"/>
+              <w:color w:val="231F20"/>
+              <w:w w:val="80"/>
+              <w:kern w:val="2"/>
+              <w:sz w:val="16"/>
+              <w:szCs w:val="16"/>
+            </w:rPr>
+            <w:t>Ostim OSB Mh. 1227 Cd. No: 6/C 06374 Ostim -Ankara-/TÜRKİYE</w:t>
+          </w:r>
+        </w:p>
+      </w:tc>
+    </w:tr>
+    <w:tr>
+      <w:trPr/>
+      <w:tc>
+        <w:tcPr>
+          <w:tcW w:w="4155" w:type="dxa"/>
+          <w:tcBorders/>
+        </w:tcPr>
+        <w:p>
+          <w:pPr>
+            <w:pStyle w:val="Normal"/>
+            <w:ind w:left="-567"/>
+            <w:jc w:val="both"/>
+            <w:rPr/>
+          </w:pPr>
+          <w:r>
+            <w:rPr>
+              <w:rFonts w:cs="Tahoma" w:ascii="Tahoma" w:hAnsi="Tahoma"/>
+              <w:color w:val="231F20"/>
+              <w:w w:val="80"/>
+              <w:kern w:val="2"/>
+              <w:sz w:val="16"/>
+              <w:szCs w:val="16"/>
+            </w:rPr>
+            <w:t>Tel: +90 312 466 19 22     Faks: +90 312 426 85 14</w:t>
+          </w:r>
+        </w:p>
+      </w:tc>
+      <w:tc>
+        <w:tcPr>
+          <w:tcW w:w="4156" w:type="dxa"/>
+          <w:tcBorders/>
+        </w:tcPr>
+        <w:p>
+          <w:pPr>
+            <w:pStyle w:val="Normal"/>
+            <w:ind w:left="-567"/>
+            <w:jc w:val="both"/>
+            <w:rPr/>
+          </w:pPr>
+          <w:r>
+            <w:rPr>
+              <w:rFonts w:cs="Tahoma" w:ascii="Tahoma" w:hAnsi="Tahoma"/>
+              <w:color w:val="231F20"/>
+              <w:w w:val="80"/>
+              <w:kern w:val="2"/>
+              <w:sz w:val="16"/>
+              <w:szCs w:val="16"/>
+            </w:rPr>
+            <w:t>Tel: +90 312 354 90 81     Faks: +90 312 354 90 82</w:t>
+          </w:r>
+        </w:p>
+      </w:tc>
+    </w:tr>
+    <w:tr>
+      <w:trPr/>
+      <w:tc>
+        <w:tcPr>
+          <w:tcW w:w="8311" w:type="dxa"/>
+          <w:gridSpan w:val="2"/>
+          <w:tcBorders/>
+        </w:tcPr>
+        <w:p>
+          <w:pPr>
+            <w:pStyle w:val="Normal"/>
+            <w:ind w:left="-567"/>
+            <w:jc w:val="both"/>
+            <w:rPr/>
+          </w:pPr>
+          <w:r>
+            <w:rPr/>
+          </w:r>
+        </w:p>
+      </w:tc>
+    </w:tr>
+  </w:tbl>
 </w:ftr>
 </file>
 
 <file path=word/footer3.xml><?xml version="1.0" encoding="utf-8"?>
 <w:ftr xmlns:o="urn:schemas-microsoft-com:office:office" xmlns:r="http://schemas.openxmlformats.org/officeDocument/2006/relationships" xmlns:v="urn:schemas-microsoft-com:vml" xmlns:w="http://schemas.openxmlformats.org/wordprocessingml/2006/main" xmlns:w10="urn:schemas-microsoft-com:office:word" xmlns:wp="http://schemas.openxmlformats.org/drawingml/2006/wordprocessingDrawing" xmlns:pic="http://schemas.openxmlformats.org/drawingml/2006/picture" xmlns:wps="http://schemas.microsoft.com/office/word/2010/wordprocessingShape" xmlns:wpg="http://schemas.microsoft.com/office/word/2010/wordprocessingGroup" xmlns:mc="http://schemas.openxmlformats.org/markup-compatibility/2006" xmlns:wp14="http://schemas.microsoft.com/office/word/2010/wordprocessingDrawing" xmlns:w14="http://schemas.microsoft.com/office/word/2010/wordml" xmlns:w15="http://schemas.microsoft.com/office/word/2012/wordml" mc:Ignorable="w14 wp14 w15">
-  <w:p>
-    <w:pPr>
-      <w:pStyle w:val="Normal"/>
-      <w:ind w:left="-567"/>
-      <w:jc w:val="both"/>
-      <w:rPr/>
-    </w:pPr>
-    <w:r>
-      <w:rPr>
-        <w:sz w:val="14"/>
-        <w:szCs w:val="14"/>
-      </w:rPr>
-      <w:t>F86 Rev04 30.11.2022</w:t>
-    </w:r>
-  </w:p>
-  <w:p>
-    <w:pPr>
-      <w:pStyle w:val="Normal"/>
-      <w:tabs>
-        <w:tab w:val="clear" w:pos="720"/>
-        <w:tab w:val="center" w:pos="4819" w:leader="none"/>
-      </w:tabs>
-      <w:ind w:left="-567"/>
-      <w:jc w:val="both"/>
-      <w:rPr/>
-    </w:pPr>
-    <w:r>
-      <w:rPr>
-        <w:rFonts w:cs="Tahoma" w:ascii="Tahoma" w:hAnsi="Tahoma"/>
-        <w:b/>
-        <w:color w:val="231F20"/>
-        <w:sz w:val="16"/>
-        <w:szCs w:val="16"/>
-      </w:rPr>
-      <w:t>Merkez Ofis</w:t>
-      <w:tab/>
-      <w:t>Üretim</w:t>
-    </w:r>
-  </w:p>
-  <w:p>
-    <w:pPr>
-      <w:pStyle w:val="Normal"/>
-      <w:tabs>
-        <w:tab w:val="clear" w:pos="720"/>
-        <w:tab w:val="center" w:pos="4819" w:leader="none"/>
-      </w:tabs>
-      <w:ind w:left="-567"/>
-      <w:jc w:val="both"/>
-      <w:rPr/>
-    </w:pPr>
-    <w:r>
-      <w:rPr>
-        <w:rFonts w:cs="Tahoma" w:ascii="Tahoma" w:hAnsi="Tahoma"/>
-        <w:color w:val="231F20"/>
-        <w:sz w:val="16"/>
-        <w:szCs w:val="16"/>
-      </w:rPr>
-      <w:t>Cinnah Caddesi No:11/5 06690 Çankaya – Ankara/TÜRKİYE</w:t>
-      <w:tab/>
-      <w:t xml:space="preserve">                OSB Mh. 1227 Cd. No: 6/C 06374 OstimAnkara-/TÜRKİYE</w:t>
-    </w:r>
-  </w:p>
-  <w:p>
-    <w:pPr>
-      <w:pStyle w:val="Normal"/>
-      <w:pBdr>
-        <w:top w:val="single" w:sz="12" w:space="1" w:color="231F20"/>
-      </w:pBdr>
-      <w:ind w:left="-567"/>
-      <w:rPr/>
-    </w:pPr>
-    <w:r>
-      <w:rPr/>
-    </w:r>
-  </w:p>
-  <w:p>
-    <w:pPr>
-      <w:pStyle w:val="Normal"/>
-      <w:tabs>
-        <w:tab w:val="clear" w:pos="720"/>
-        <w:tab w:val="center" w:pos="4819" w:leader="none"/>
-      </w:tabs>
-      <w:ind w:left="-567"/>
-      <w:jc w:val="both"/>
-      <w:rPr/>
-    </w:pPr>
-    <w:r>
-      <w:rPr>
-        <w:rFonts w:cs="Tahoma" w:ascii="Tahoma" w:hAnsi="Tahoma"/>
-        <w:color w:val="231F20"/>
-        <w:sz w:val="16"/>
-        <w:szCs w:val="16"/>
-      </w:rPr>
-      <w:t>Tel: +90 312 466 19 22     Faks: +90 312 426 85 14</w:t>
-      <w:tab/>
-      <w:t>Tel: +90 312 354 90 81     Faks: +90 312 354 90 82</w:t>
-    </w:r>
-  </w:p>
-  <w:p>
-    <w:pPr>
-      <w:pStyle w:val="Normal"/>
-      <w:ind w:left="-567"/>
-      <w:jc w:val="both"/>
-      <w:rPr/>
-    </w:pPr>
-    <w:r>
-      <w:rPr/>
-    </w:r>
-  </w:p>
+  <w:tbl>
+    <w:tblPr>
+      <w:tblW w:w="5000" w:type="pct"/>
+      <w:jc w:val="left"/>
+      <w:tblInd w:w="0" w:type="dxa"/>
+      <w:tblLayout w:type="fixed"/>
+      <w:tblCellMar>
+        <w:top w:w="0" w:type="dxa"/>
+        <w:left w:w="108" w:type="dxa"/>
+        <w:bottom w:w="0" w:type="dxa"/>
+        <w:right w:w="108" w:type="dxa"/>
+      </w:tblCellMar>
+      <w:tblLook w:val="04a0" w:noHBand="0" w:noVBand="1" w:firstColumn="1" w:lastRow="0" w:lastColumn="0" w:firstRow="1"/>
+    </w:tblPr>
+    <w:tblGrid>
+      <w:gridCol w:w="4155"/>
+      <w:gridCol w:w="4156"/>
+    </w:tblGrid>
+    <w:tr>
+      <w:trPr/>
+      <w:tc>
+        <w:tcPr>
+          <w:tcW w:w="8311" w:type="dxa"/>
+          <w:gridSpan w:val="2"/>
+          <w:tcBorders/>
+        </w:tcPr>
+        <w:p>
+          <w:pPr>
+            <w:pStyle w:val="Normal"/>
+            <w:ind w:left="-567"/>
+            <w:jc w:val="both"/>
+            <w:rPr/>
+          </w:pPr>
+          <w:r>
+            <w:rPr>
+              <w:sz w:val="14"/>
+              <w:szCs w:val="12"/>
+            </w:rPr>
+            <w:t>F86 Rev04 30.11.2022</w:t>
+          </w:r>
+        </w:p>
+      </w:tc>
+    </w:tr>
+    <w:tr>
+      <w:trPr/>
+      <w:tc>
+        <w:tcPr>
+          <w:tcW w:w="4155" w:type="dxa"/>
+          <w:tcBorders/>
+        </w:tcPr>
+        <w:p>
+          <w:pPr>
+            <w:pStyle w:val="Normal"/>
+            <w:ind w:left="-567"/>
+            <w:jc w:val="both"/>
+            <w:rPr/>
+          </w:pPr>
+          <w:r>
+            <w:rPr>
+              <w:rFonts w:cs="Tahoma" w:ascii="Tahoma" w:hAnsi="Tahoma"/>
+              <w:b/>
+              <w:color w:val="231F20"/>
+              <w:w w:val="80"/>
+              <w:sz w:val="16"/>
+              <w:szCs w:val="16"/>
+            </w:rPr>
+            <w:t>Merkez Ofis</w:t>
+          </w:r>
+        </w:p>
+      </w:tc>
+      <w:tc>
+        <w:tcPr>
+          <w:tcW w:w="4156" w:type="dxa"/>
+          <w:tcBorders/>
+        </w:tcPr>
+        <w:p>
+          <w:pPr>
+            <w:pStyle w:val="Normal"/>
+            <w:ind w:left="-567"/>
+            <w:jc w:val="both"/>
+            <w:rPr/>
+          </w:pPr>
+          <w:r>
+            <w:rPr>
+              <w:rFonts w:cs="Tahoma" w:ascii="Tahoma" w:hAnsi="Tahoma"/>
+              <w:b/>
+              <w:color w:val="231F20"/>
+              <w:w w:val="80"/>
+              <w:sz w:val="16"/>
+              <w:szCs w:val="16"/>
+            </w:rPr>
+            <w:t>Üretim</w:t>
+          </w:r>
+        </w:p>
+      </w:tc>
+    </w:tr>
+    <w:tr>
+      <w:trPr/>
+      <w:tc>
+        <w:tcPr>
+          <w:tcW w:w="4155" w:type="dxa"/>
+          <w:tcBorders/>
+        </w:tcPr>
+        <w:p>
+          <w:pPr>
+            <w:pStyle w:val="Normal"/>
+            <w:ind w:left="-567"/>
+            <w:jc w:val="both"/>
+            <w:rPr/>
+          </w:pPr>
+          <w:r>
+            <w:rPr>
+              <w:rFonts w:cs="Tahoma" w:ascii="Tahoma" w:hAnsi="Tahoma"/>
+              <w:color w:val="231F20"/>
+              <w:w w:val="80"/>
+              <w:kern w:val="2"/>
+              <w:sz w:val="16"/>
+              <w:szCs w:val="16"/>
+            </w:rPr>
+            <w:t>Cinnah Caddesi No:11/5 06690 Çankaya – Ankara/TÜRKİYE</w:t>
+          </w:r>
+        </w:p>
+      </w:tc>
+      <w:tc>
+        <w:tcPr>
+          <w:tcW w:w="4156" w:type="dxa"/>
+          <w:tcBorders/>
+        </w:tcPr>
+        <w:p>
+          <w:pPr>
+            <w:pStyle w:val="Normal"/>
+            <w:ind w:left="-567"/>
+            <w:jc w:val="both"/>
+            <w:rPr/>
+          </w:pPr>
+          <w:r>
+            <w:rPr>
+              <w:rFonts w:cs="Tahoma" w:ascii="Tahoma" w:hAnsi="Tahoma"/>
+              <w:color w:val="231F20"/>
+              <w:w w:val="80"/>
+              <w:kern w:val="2"/>
+              <w:sz w:val="16"/>
+              <w:szCs w:val="16"/>
+            </w:rPr>
+            <w:t>Ostim OSB Mh. 1227 Cd. No: 6/C 06374 Ostim -Ankara-/TÜRKİYE</w:t>
+          </w:r>
+        </w:p>
+      </w:tc>
+    </w:tr>
+    <w:tr>
+      <w:trPr/>
+      <w:tc>
+        <w:tcPr>
+          <w:tcW w:w="4155" w:type="dxa"/>
+          <w:tcBorders/>
+        </w:tcPr>
+        <w:p>
+          <w:pPr>
+            <w:pStyle w:val="Normal"/>
+            <w:ind w:left="-567"/>
+            <w:jc w:val="both"/>
+            <w:rPr/>
+          </w:pPr>
+          <w:r>
+            <w:rPr>
+              <w:rFonts w:cs="Tahoma" w:ascii="Tahoma" w:hAnsi="Tahoma"/>
+              <w:color w:val="231F20"/>
+              <w:w w:val="80"/>
+              <w:kern w:val="2"/>
+              <w:sz w:val="16"/>
+              <w:szCs w:val="16"/>
+            </w:rPr>
+            <w:t>Tel: +90 312 466 19 22     Faks: +90 312 426 85 14</w:t>
+          </w:r>
+        </w:p>
+      </w:tc>
+      <w:tc>
+        <w:tcPr>
+          <w:tcW w:w="4156" w:type="dxa"/>
+          <w:tcBorders/>
+        </w:tcPr>
+        <w:p>
+          <w:pPr>
+            <w:pStyle w:val="Normal"/>
+            <w:ind w:left="-567"/>
+            <w:jc w:val="both"/>
+            <w:rPr/>
+          </w:pPr>
+          <w:r>
+            <w:rPr>
+              <w:rFonts w:cs="Tahoma" w:ascii="Tahoma" w:hAnsi="Tahoma"/>
+              <w:color w:val="231F20"/>
+              <w:w w:val="80"/>
+              <w:kern w:val="2"/>
+              <w:sz w:val="16"/>
+              <w:szCs w:val="16"/>
+            </w:rPr>
+            <w:t>Tel: +90 312 354 90 81     Faks: +90 312 354 90 82</w:t>
+          </w:r>
+        </w:p>
+      </w:tc>
+    </w:tr>
+    <w:tr>
+      <w:trPr/>
+      <w:tc>
+        <w:tcPr>
+          <w:tcW w:w="8311" w:type="dxa"/>
+          <w:gridSpan w:val="2"/>
+          <w:tcBorders/>
+        </w:tcPr>
+        <w:p>
+          <w:pPr>
+            <w:pStyle w:val="Normal"/>
+            <w:ind w:left="-567"/>
+            <w:jc w:val="both"/>
+            <w:rPr/>
+          </w:pPr>
+          <w:r>
+            <w:rPr/>
+          </w:r>
+        </w:p>
+      </w:tc>
+    </w:tr>
+  </w:tbl>
 </w:ftr>
 </file>
 
 <file path=word/header1.xml><?xml version="1.0" encoding="utf-8"?>
-<w:hdr xmlns:o="urn:schemas-microsoft-com:office:office" xmlns:r="http://schemas.openxmlformats.org/officeDocument/2006/relationships" xmlns:v="urn:schemas-microsoft-com:vml" xmlns:w="http://schemas.openxmlformats.org/wordprocessingml/2006/main" xmlns:w10="urn:schemas-microsoft-com:office:word" xmlns:wp="http://schemas.openxmlformats.org/drawingml/2006/wordprocessingDrawing" xmlns:pic="http://schemas.openxmlformats.org/drawingml/2006/picture" xmlns:wps="http://schemas.microsoft.com/office/word/2010/wordprocessingShape" xmlns:wpg="http://schemas.microsoft.com/office/word/2010/wordprocessingGroup" xmlns:mc="http://schemas.openxmlformats.org/markup-compatibility/2006" xmlns:wp14="http://schemas.microsoft.com/office/word/2010/wordprocessingDrawing" xmlns:w14="http://schemas.microsoft.com/office/word/2010/wordml" xmlns:w15="http://schemas.microsoft.com/office/word/2012/wordml" mc:Ignorable="w14 wp14 w15">
-  <w:p>
-    <w:pPr>
-      <w:pStyle w:val="Header"/>
-      <w:rPr/>
-    </w:pPr>
-    <w:r>
-      <w:rPr/>
-    </w:r>
-  </w:p>
+<w:hdr xmlns:w="http://schemas.openxmlformats.org/wordprocessingml/2006/main" xmlns:r="http://schemas.openxmlformats.org/officeDocument/2006/relationships" xmlns:wp="http://schemas.openxmlformats.org/drawingml/2006/wordprocessingDrawing" xmlns:a="http://schemas.openxmlformats.org/drawingml/2006/main" xmlns:pic="http://schemas.openxmlformats.org/drawingml/2006/picture">
+  <w:tbl>
+    <w:tblPr>
+      <w:tblW w:w="5000" w:type="pct"/>
+      <w:tblBorders>
+        <w:bottom w:val="single" w:sz="4" w:space="0" w:color="auto"/>
+      </w:tblBorders>
+    </w:tblPr>
+    <w:tr>
+      <w:tc>
+        <w:tcPr>
+          <w:vAlign w:val="center"/>
+        </w:tcPr>
+        <w:p>
+          <w:pPr>
+            <w:jc w:val="left"/>
+          </w:pPr>
+          <w:r>
+            <w:drawing>
+              <wp:inline distT="0" distB="0" distL="0" distR="0">
+                <wp:extent cx="1143000" cy="571500"/>
+                <wp:docPr id="1" name="LetterheadLogo"/>
+                <a:graphic>
+                  <a:graphicData uri="http://schemas.openxmlformats.org/drawingml/2006/picture">
+                    <pic:pic>
+                      <pic:nvPicPr>
+                        <pic:cNvPr id="0" name="LetterheadLogo"/>
+                        <pic:cNvPicPr/>
+                      </pic:nvPicPr>
+                      <pic:blipFill>
+                        <a:blip r:embed="rId1"/>
+                        <a:stretch>
+                          <a:fillRect/>
+                        </a:stretch>
+                      </pic:blipFill>
+                      <pic:spPr>
+                        <a:xfrm>
+                          <a:off x="0" y="0"/>
+                          <a:ext cx="1143000" cy="571500"/>
+                        </a:xfrm>
+                        <a:prstGeom prst="rect">
+                          <a:avLst/>
+                        </a:prstGeom>
+                      </pic:spPr>
+                    </pic:pic>
+                  </a:graphicData>
+                </a:graphic>
+              </wp:inline>
+            </w:drawing>
+          </w:r>
+        </w:p>
+      </w:tc>
+      <w:tc>
+        <w:tcPr>
+          <w:vAlign w:val="center"/>
+        </w:tcPr>
+        <w:p>
+          <w:pPr>
+            <w:jc w:val="center"/>
+          </w:pPr>
+          <w:r>
+            <w:rPr>
+              <w:b/>
+            </w:rPr>
+            <w:t xml:space="preserve">{{documentName}}</w:t>
+          </w:r>
+        </w:p>
+      </w:tc>
+      <w:tc>
+        <w:tcPr>
+          <w:vAlign w:val="center"/>
+        </w:tcPr>
+        <w:p>
+          <w:pPr>
+            <w:jc w:val="right"/>
+          </w:pPr>
+          <w:r>
+            <w:t xml:space="preserve">{{docNo}}</w:t>
+          </w:r>
+          <w:r>
+            <w:br/>
+          </w:r>
+          <w:r>
+            <w:t xml:space="preserve">{{generatedAt}}</w:t>
+          </w:r>
+        </w:p>
+      </w:tc>
+    </w:tr>
+  </w:tbl>
 </w:hdr>
 </file>
 
@@ -1019,9 +1540,9 @@
 <w:hdr xmlns:o="urn:schemas-microsoft-com:office:office" xmlns:r="http://schemas.openxmlformats.org/officeDocument/2006/relationships" xmlns:v="urn:schemas-microsoft-com:vml" xmlns:w="http://schemas.openxmlformats.org/wordprocessingml/2006/main" xmlns:w10="urn:schemas-microsoft-com:office:word" xmlns:wp="http://schemas.openxmlformats.org/drawingml/2006/wordprocessingDrawing" xmlns:pic="http://schemas.openxmlformats.org/drawingml/2006/picture" xmlns:wps="http://schemas.microsoft.com/office/word/2010/wordprocessingShape" xmlns:wpg="http://schemas.microsoft.com/office/word/2010/wordprocessingGroup" xmlns:mc="http://schemas.openxmlformats.org/markup-compatibility/2006" xmlns:wp14="http://schemas.microsoft.com/office/word/2010/wordprocessingDrawing" xmlns:w14="http://schemas.microsoft.com/office/word/2010/wordml" xmlns:w15="http://schemas.microsoft.com/office/word/2012/wordml" mc:Ignorable="w14 wp14 w15">
   <w:tbl>
     <w:tblPr>
-      <w:tblW w:w="10710" w:type="dxa"/>
+      <w:tblW w:w="5000" w:type="pct"/>
       <w:jc w:val="left"/>
-      <w:tblInd w:w="-1028" w:type="dxa"/>
+      <w:tblInd w:w="0" w:type="dxa"/>
       <w:tblLayout w:type="fixed"/>
       <w:tblCellMar>
         <w:top w:w="0" w:type="dxa"/>
@@ -1031,17 +1552,15 @@
       </w:tblCellMar>
     </w:tblPr>
     <w:tblGrid>
-      <w:gridCol w:w="1845"/>
-      <w:gridCol w:w="6060"/>
-      <w:gridCol w:w="2805"/>
+      <w:gridCol w:w="2770"/>
+      <w:gridCol w:w="2771"/>
+      <w:gridCol w:w="2771"/>
     </w:tblGrid>
     <w:tr>
-      <w:trPr>
-        <w:trHeight w:val="1017" w:hRule="atLeast"/>
-      </w:trPr>
-      <w:tc>
-        <w:tcPr>
-          <w:tcW w:w="1845" w:type="dxa"/>
+      <w:trPr/>
+      <w:tc>
+        <w:tcPr>
+          <w:tcW w:w="2770" w:type="dxa"/>
           <w:tcBorders>
             <w:bottom w:val="single" w:sz="4" w:space="0" w:color="000000"/>
           </w:tcBorders>
@@ -1057,7 +1576,7 @@
             <w:rPr/>
             <w:drawing>
               <wp:inline distT="0" distB="0" distL="0" distR="0">
-                <wp:extent cx="829945" cy="571500"/>
+                <wp:extent cx="1143000" cy="571500"/>
                 <wp:effectExtent l="0" t="0" r="0" b="0"/>
                 <wp:docPr id="1" name="LetterheadLogo" descr=""/>
                 <wp:cNvGraphicFramePr>
@@ -1081,7 +1600,7 @@
                       <pic:spPr bwMode="auto">
                         <a:xfrm>
                           <a:off x="0" y="0"/>
-                          <a:ext cx="829945" cy="571500"/>
+                          <a:ext cx="1143000" cy="571500"/>
                         </a:xfrm>
                         <a:prstGeom prst="rect">
                           <a:avLst/>
@@ -1097,7 +1616,7 @@
       </w:tc>
       <w:tc>
         <w:tcPr>
-          <w:tcW w:w="6060" w:type="dxa"/>
+          <w:tcW w:w="2771" w:type="dxa"/>
           <w:tcBorders>
             <w:bottom w:val="single" w:sz="4" w:space="0" w:color="000000"/>
           </w:tcBorders>
@@ -1113,13 +1632,13 @@
             <w:rPr>
               <w:b/>
             </w:rPr>
-            <w:t>Uygunluk Belgesi</w:t>
-          </w:r>
-        </w:p>
-      </w:tc>
-      <w:tc>
-        <w:tcPr>
-          <w:tcW w:w="2805" w:type="dxa"/>
+            <w:t>{{documentName}}</w:t>
+          </w:r>
+        </w:p>
+      </w:tc>
+      <w:tc>
+        <w:tcPr>
+          <w:tcW w:w="2771" w:type="dxa"/>
           <w:tcBorders>
             <w:bottom w:val="single" w:sz="4" w:space="0" w:color="000000"/>
           </w:tcBorders>
@@ -1148,9 +1667,9 @@
 <w:hdr xmlns:o="urn:schemas-microsoft-com:office:office" xmlns:r="http://schemas.openxmlformats.org/officeDocument/2006/relationships" xmlns:v="urn:schemas-microsoft-com:vml" xmlns:w="http://schemas.openxmlformats.org/wordprocessingml/2006/main" xmlns:w10="urn:schemas-microsoft-com:office:word" xmlns:wp="http://schemas.openxmlformats.org/drawingml/2006/wordprocessingDrawing" xmlns:pic="http://schemas.openxmlformats.org/drawingml/2006/picture" xmlns:wps="http://schemas.microsoft.com/office/word/2010/wordprocessingShape" xmlns:wpg="http://schemas.microsoft.com/office/word/2010/wordprocessingGroup" xmlns:mc="http://schemas.openxmlformats.org/markup-compatibility/2006" xmlns:wp14="http://schemas.microsoft.com/office/word/2010/wordprocessingDrawing" xmlns:w14="http://schemas.microsoft.com/office/word/2010/wordml" xmlns:w15="http://schemas.microsoft.com/office/word/2012/wordml" mc:Ignorable="w14 wp14 w15">
   <w:tbl>
     <w:tblPr>
-      <w:tblW w:w="10710" w:type="dxa"/>
+      <w:tblW w:w="5000" w:type="pct"/>
       <w:jc w:val="left"/>
-      <w:tblInd w:w="-1028" w:type="dxa"/>
+      <w:tblInd w:w="0" w:type="dxa"/>
       <w:tblLayout w:type="fixed"/>
       <w:tblCellMar>
         <w:top w:w="0" w:type="dxa"/>
@@ -1160,17 +1679,15 @@
       </w:tblCellMar>
     </w:tblPr>
     <w:tblGrid>
-      <w:gridCol w:w="1845"/>
-      <w:gridCol w:w="6060"/>
-      <w:gridCol w:w="2805"/>
+      <w:gridCol w:w="2770"/>
+      <w:gridCol w:w="2771"/>
+      <w:gridCol w:w="2771"/>
     </w:tblGrid>
     <w:tr>
-      <w:trPr>
-        <w:trHeight w:val="1017" w:hRule="atLeast"/>
-      </w:trPr>
-      <w:tc>
-        <w:tcPr>
-          <w:tcW w:w="1845" w:type="dxa"/>
+      <w:trPr/>
+      <w:tc>
+        <w:tcPr>
+          <w:tcW w:w="2770" w:type="dxa"/>
           <w:tcBorders>
             <w:bottom w:val="single" w:sz="4" w:space="0" w:color="000000"/>
           </w:tcBorders>
@@ -1186,7 +1703,7 @@
             <w:rPr/>
             <w:drawing>
               <wp:inline distT="0" distB="0" distL="0" distR="0">
-                <wp:extent cx="829945" cy="571500"/>
+                <wp:extent cx="1143000" cy="571500"/>
                 <wp:effectExtent l="0" t="0" r="0" b="0"/>
                 <wp:docPr id="2" name="LetterheadLogo" descr=""/>
                 <wp:cNvGraphicFramePr>
@@ -1210,7 +1727,7 @@
                       <pic:spPr bwMode="auto">
                         <a:xfrm>
                           <a:off x="0" y="0"/>
-                          <a:ext cx="829945" cy="571500"/>
+                          <a:ext cx="1143000" cy="571500"/>
                         </a:xfrm>
                         <a:prstGeom prst="rect">
                           <a:avLst/>
@@ -1226,7 +1743,7 @@
       </w:tc>
       <w:tc>
         <w:tcPr>
-          <w:tcW w:w="6060" w:type="dxa"/>
+          <w:tcW w:w="2771" w:type="dxa"/>
           <w:tcBorders>
             <w:bottom w:val="single" w:sz="4" w:space="0" w:color="000000"/>
           </w:tcBorders>
@@ -1242,13 +1759,13 @@
             <w:rPr>
               <w:b/>
             </w:rPr>
-            <w:t>Uygunluk Belgesi</w:t>
-          </w:r>
-        </w:p>
-      </w:tc>
-      <w:tc>
-        <w:tcPr>
-          <w:tcW w:w="2805" w:type="dxa"/>
+            <w:t>{{documentName}}</w:t>
+          </w:r>
+        </w:p>
+      </w:tc>
+      <w:tc>
+        <w:tcPr>
+          <w:tcW w:w="2771" w:type="dxa"/>
           <w:tcBorders>
             <w:bottom w:val="single" w:sz="4" w:space="0" w:color="000000"/>
           </w:tcBorders>
@@ -2078,7 +2595,6 @@
     <w:qFormat/>
     <w:pPr>
       <w:widowControl w:val="false"/>
-      <w:suppressAutoHyphens w:val="true"/>
       <w:bidi w:val="0"/>
       <w:spacing w:before="0" w:after="0"/>
       <w:jc w:val="left"/>

</xml_diff>